<commit_message>
Re-open PCP-003 and PCP-006 for the shared resolutions of 2026-10-10; annexes re-anchored
- Both plans state the widening rule as PCMP-001 §7.5 rule 2 does (the first three adequacy criteria, not an
  exact fit; the fourth does not decide; the report that gives the bound examines it), draw the operating
  region on the 95 % prediction interval of a single run (PCP-006 restores Version 1.0 §7.3 as §7.6), name both
  INV-001 findings on the Version 1.0 record, keep the Version 1.0 classification sentence with PCMP-001 §6.2
  and §7.7 listed as a change, state PCMP-001's remedy, restore the region objective, and take the Cook's
  cut-off and the residual-test level from THRESHOLDS. D-001 untouched. Gates OK (PCP-003 42 pp, PCP-006 40 pp).
- Annexes rebuilt; one quote each re-anchored on the reworded sentence; 540/540 grounded. 206 tests pass.

Co-Authored-By: Claude Opus 5.5 <noreply@anthropic.com>
</commit_message>
<xml_diff>
--- a/pc_package/PCP-003_bioreactor.docx
+++ b/pc_package/PCP-003_bioreactor.docx
@@ -2429,7 +2429,7 @@
         </w:r>
       </w:hyperlink>
       <w:r>
-        <w:t xml:space="preserve">). The master plan PCMP-001 derives these criteria a priori from the drug substance criteria and the worst case of every downstream step on the platform (PCMP-001 §7.3). They replace the criterion basis of Version 1.0, an in-process limit derived from the nominal downstream clearance with a margin held between the two. They also replace the Version 1.0 analysis limits. For the glycans and acidic variants, the Version 1.0 upper limit was the mean plus 2.5 standard deviations of the capability data that it was then used to judge (INV-001 finding 3). For aggregate, Version 1.0 carried the drug substance limit back through the nominal downstream clearance of this campaign and then divided it by a safety factor of 6.8 (INV-001 finding 2).</w:t>
+        <w:t xml:space="preserve">). The master plan PCMP-001 derives these criteria a priori from the drug substance criteria and the worst case of every downstream step on the platform (PCMP-001 §7.3). They replace the criterion basis of Version 1.0, an in-process limit derived from the nominal downstream clearance with a margin held between the two. That basis was written into the plan text when the package was compiled, and it was not approved with the plan (INV-001 finding 1). They also replace the Version 1.0 analysis limits. For the glycans and acidic variants, the Version 1.0 upper limit was the mean plus 2.5 standard deviations of the capability data that it was then used to judge (INV-001 finding 3). For aggregate, Version 1.0 carried the drug substance limit back through the nominal downstream clearance of this campaign and then divided it by a safety factor of 6.8 (INV-001 finding 2).</w:t>
       </w:r>
     </w:p>
     <w:p>
@@ -2499,7 +2499,7 @@
         </w:numPr>
       </w:pPr>
       <w:r>
-        <w:t xml:space="preserve">Version 2.0 states the campaign thresholds for model adequacy (PCMP-001 §7.2). The model F-test must be significant at α = 0.05, lack of fit must not be significant at α = 0.05, and predicted R² must fall short of R² by no more than 0.20. The last replaces the Version 1.0 requirement that predicted R² track adjusted R². A failing model may also be refitted with a justified change of terms or transformation (PCMP-001 §7.2). The other adequacy rules of Version 1.0 are kept.</w:t>
+        <w:t xml:space="preserve">Version 2.0 states the campaign thresholds for model adequacy (PCMP-001 §7.2). The model F-test must be significant at α = 0.05, lack of fit must not be significant at α = 0.05, and predicted R² must fall short of R² by no more than 0.20. The last replaces the Version 1.0 requirement that predicted R² track adjusted R². The remedy of PCMP-001 §7.2 replaces the Version 1.0 consequence of a failing model, which was that the model would be reduced, or the design augmented, and the revised model reported with the reason for the revision. A model that fails the lack-of-fit test or the limit on overfitting is now either refitted with a justified change of terms or transformation, or it is not used to set a range. The other adequacy rules of Version 1.0 are kept.</w:t>
       </w:r>
     </w:p>
     <w:p>
@@ -2557,6 +2557,52 @@
         </w:numPr>
       </w:pPr>
       <w:r>
+        <w:t xml:space="preserve">Version 2.0 draws the operating region, which PCMP-001 calls the design space, on the single-batch limit (PCMP-001 §6.2). A setting lies inside the region when every modelled attribute meets its criterion at both ends of the 95 % prediction interval of a single run (</w:t>
+      </w:r>
+      <w:hyperlink w:anchor="sec-criteria">
+        <w:r>
+          <w:rPr>
+            <w:rStyle w:val="Hyperlink"/>
+          </w:rPr>
+          <w:t xml:space="preserve">Section 7</w:t>
+        </w:r>
+      </w:hyperlink>
+      <w:r>
+        <w:t xml:space="preserve">). Version 1.0 declared the region where the response-surface models predict that every modelled attribute meets its criterion, that is on the mean prediction.</w:t>
+      </w:r>
+    </w:p>
+    <w:p>
+      <w:pPr>
+        <w:pStyle w:val="Compact"/>
+        <w:numPr>
+          <w:ilvl w:val="0"/>
+          <w:numId w:val="1001"/>
+        </w:numPr>
+      </w:pPr>
+      <w:r>
+        <w:t xml:space="preserve">Version 2.0 adds two rules of PCMP-001 to the classification, whose Version 1.0 rule is kept word for word (</w:t>
+      </w:r>
+      <w:hyperlink w:anchor="sec-criteria">
+        <w:r>
+          <w:rPr>
+            <w:rStyle w:val="Hyperlink"/>
+          </w:rPr>
+          <w:t xml:space="preserve">Section 7</w:t>
+        </w:r>
+      </w:hyperlink>
+      <w:r>
+        <w:t xml:space="preserve">). Under PCMP-001 §6.2 an attribute is affected by a parameter when a term that contains the parameter is significant. Under PCMP-001 §7.7 a significant effect that is too small to move the attribute appreciably within the PAR does not by itself make a parameter critical. The report states the size of each effect across the PAR and the margin of the PAR to the NOR, and it argues each class on them. Version 1.0 did not define when a parameter affects an attribute, and it classified every parameter that affects a critical quality attribute as critical or as well controlled critical.</w:t>
+      </w:r>
+    </w:p>
+    <w:p>
+      <w:pPr>
+        <w:pStyle w:val="Compact"/>
+        <w:numPr>
+          <w:ilvl w:val="0"/>
+          <w:numId w:val="1001"/>
+        </w:numPr>
+      </w:pPr>
+      <w:r>
         <w:t xml:space="preserve">Version 2.0 states the grid of the analysis at the set-points as the 201 points that the analysis uses. Version 1.0 stated 81 points for both analyses.</w:t>
       </w:r>
     </w:p>
@@ -2580,7 +2626,7 @@
         </w:r>
       </w:hyperlink>
       <w:r>
-        <w:t xml:space="preserve">). The Version 1.0 records gave no execution dates (INV-001 finding 5). The Version 1.0 title block carried 2026-07-24, the date on which the Version 1.0 reports were approved, in place of the date on which this plan was approved. The revision history now gives the approval date.</w:t>
+        <w:t xml:space="preserve">). The Version 1.0 records gave no execution dates (INV-001 finding 5). The Version 1.0 title block carried 2026-07-24, the date on which the Version 1.0 reports were approved, in place of the date on which this plan was approved (INV-001 finding 5). The compiled text of Version 1.0 also carried the criterion basis that change 1 replaces, added to the plan text when the package was compiled, without a revision of the approved plan (INV-001 finding 1). The revision history now gives the approval date.</w:t>
       </w:r>
     </w:p>
     <w:p>
@@ -3237,7 +3283,7 @@
                     <w:t xml:space="preserve"> </w:t>
                   </w:r>
                   <w:r>
-                    <w:t xml:space="preserve">Widened on verification: a downstream step did better than the platform worst case at the one-sided 95 % prediction bound of a single batch, on an adequate model.</w:t>
+                    <w:t xml:space="preserve">Widened on verification: a downstream step did better than the platform worst case at the one-sided 95 % prediction bound of a single batch, on a model that meets the first three adequacy criteria of PCMP-001 §7.2.</w:t>
                   </w:r>
                 </w:p>
               </w:tc>
@@ -6365,7 +6411,7 @@
         <w:t xml:space="preserve">(CMC Biotech Working Group 2009)</w:t>
       </w:r>
       <w:r>
-        <w:t xml:space="preserve">. For this reason each quality attribute is judged in the PAR analysis and in the scale-down qualification on the 95 % prediction interval of a single batch, not on the mean prediction (PCMP-001 §6.2).</w:t>
+        <w:t xml:space="preserve">. For this reason each quality attribute is judged in the PAR analysis, in the scale-down qualification and in the operating region on the 95 % prediction interval of a single batch, not on the mean prediction (PCMP-001 §6.2).</w:t>
       </w:r>
     </w:p>
     <w:p>
@@ -8231,7 +8277,7 @@
         </w:numPr>
       </w:pPr>
       <w:r>
-        <w:t xml:space="preserve">A model that fails any of these is not used to define an operating region or to set a range. It is reduced, refitted with a justified change of terms or transformation, or the design is augmented, and the revised model is reported with the reason for the revision (PCMP-001 §7.2). Where no adequate model results, the report states the response descriptively, against its criterion, over the runs of the designs.</w:t>
+        <w:t xml:space="preserve">A model that fails any of these is not used to define an operating region or to set a range. A model that fails the lack-of-fit test or the limit on overfitting is either refitted with a justified change of terms or transformation, or it is not used to set a range (PCMP-001 §7.2). Where no adequate model results, the report states the response descriptively, against its criterion, over the runs of the designs.</w:t>
       </w:r>
     </w:p>
     <w:p>
@@ -8304,7 +8350,7 @@
         </w:numPr>
       </w:pPr>
       <w:r>
-        <w:t xml:space="preserve">An operating region is declared over the response-surface parameters where the response-surface models predict that every modelled attribute meets its criterion. The region is declared only over the parameters varied in the response-surface design and only within the ranges studied. The NORs must lie inside the declared region. If they do not, the operating region is reported as it is found and the NOR is narrowed until it fits inside.</w:t>
+        <w:t xml:space="preserve">An operating region is declared over the response-surface parameters where every modelled attribute meets its criterion at both ends of the 95 % prediction interval of a single run from the response-surface models (PCMP-001 §6.2). The region is declared only over the parameters varied in the response-surface design and only within the ranges studied. The NORs must lie inside the declared region. If they do not, the operating region is reported as it is found and the NOR is narrowed until it fits inside.</w:t>
       </w:r>
     </w:p>
     <w:p>
@@ -8368,7 +8414,7 @@
         </w:numPr>
       </w:pPr>
       <w:r>
-        <w:t xml:space="preserve">Each parameter is classified under SOP-4001 from the effects demonstrated in these studies and from the risk that routine operation moves it outside the region in which those effects are acceptable, by the decision logic of PCMP-001 §7.7</w:t>
+        <w:t xml:space="preserve">Each parameter will be classified under SOP-4001 from the effects demonstrated in these studies and from the risk that routine operation moves it outside the region in which those effects are acceptable</w:t>
       </w:r>
       <w:r>
         <w:t xml:space="preserve"> </w:t>
@@ -8377,7 +8423,7 @@
         <w:t xml:space="preserve">(CMC Biotech Working Group 2009)</w:t>
       </w:r>
       <w:r>
-        <w:t xml:space="preserve">. A parameter whose variation affects a critical quality attribute is a critical process parameter (CPP) or a well-controlled critical process parameter (WC-CPP). The distinction between the two rests on the risk of falling outside the operating region, not on the size of the effect. A parameter that affects process performance without affecting a quality attribute is a key process parameter (KPP). A parameter with no demonstrated effect on either is a general process parameter (GPP). PCMP-001 and SOP-4001 set no numerical threshold for a high risk, a practically relevant effect or a wide PAR. The report therefore states the effect sizes and the margins between each PAR and its NOR, and it argues each class.</w:t>
+        <w:t xml:space="preserve">. A parameter whose variability affects a critical quality attribute is a critical process parameter or a well controlled critical process parameter, and the distinction between the two rests on the risk of falling outside the design space rather than on the size of the effect. A parameter that affects process performance without affecting a quality attribute is a key process parameter. A parameter with no demonstrated effect on either is a general process parameter. PCMP-001 Version 2.0 adds two rules to this one. An attribute is affected by a parameter when a term that contains the parameter is significant at α = 0.05 (PCMP-001 §6.2). A significant effect that is too small to move the attribute appreciably within the PAR does not by itself make a parameter critical (PCMP-001 §7.7). PCMP-001 and SOP-4001 set no numerical threshold for a high risk, a practically relevant effect or a wide PAR. The report therefore states the size of each effect across the PAR beside its significance and the margin between each PAR and its NOR, and it argues each class on them.</w:t>
       </w:r>
     </w:p>
     <w:p>
@@ -9163,7 +9209,7 @@
         <w:pStyle w:val="BodyText"/>
       </w:pPr>
       <w:r>
-        <w:t xml:space="preserve">Each criterion in force assumes that every downstream step performs at least as well as the worst case from which the criterion was derived. The report of each downstream step checks this from its own response-surface model, and the verification rule of PCMP-001 §7.5 lets the check change a criterion in either direction. Where the A-Mab worst case predicted within the NOR of a downstream step is worse than the platform worst case, the one-sided 95 % prediction bound of a single batch there replaces the platform value, and every criterion upstream becomes stricter. Where that bound is better than the platform value, and the model behind it meets the adequacy criteria of PCMP-001, the bound replaces the platform value, and every criterion upstream becomes wider.</w:t>
+        <w:t xml:space="preserve">Each criterion in force assumes that every downstream step performs at least as well as the worst case from which the criterion was derived. The report of each downstream step checks this from its own response-surface model, and the verification rule of PCMP-001 §7.5 lets the check change a criterion in either direction. Where the A-Mab worst case predicted within the NOR of a downstream step is worse than the platform worst case, the one-sided 95 % prediction bound of a single batch there replaces the platform value, and every criterion upstream becomes stricter. Where that bound is better than the platform value, and the response-surface model behind it meets the first three adequacy criteria of PCMP-001 §7.2 (a significant model, no significant lack of fit and the limit on overfitting) and is not an exact fit, the bound replaces the platform value, and every criterion upstream becomes wider. The fourth criterion, on the residuals and on influential runs, does not decide the change. The report that gives the bound examines it and states whether the bound depends on a single run.</w:t>
       </w:r>
     </w:p>
     <w:p>

</xml_diff>

<commit_message>
Five plans state the owner's influence rule; annexes re-anchored
- PCP-003, PCP-005, PCP-006, PCP-008, PCP-009: the generic test, in the body and in the change list,
  identically: "A run with a Cook's distance above 4/n is examined by deleting it and repeating the
  judgement. The model fails this test only where a run's Cook's distance exceeds the median of the F
  distribution with p and n − p degrees of freedom ..." (values from THRESHOLDS). D-001 sentences unchanged.
  Gates OK.
- Annexes rebuilt; three quotes re-anchored on the new sentences; 1698/1698 grounded.

Co-Authored-By: Claude Opus 5.5 <noreply@anthropic.com>
</commit_message>
<xml_diff>
--- a/pc_package/PCP-003_bioreactor.docx
+++ b/pc_package/PCP-003_bioreactor.docx
@@ -2522,7 +2522,7 @@
         </w:r>
       </w:hyperlink>
       <w:r>
-        <w:t xml:space="preserve">). A regression of the absolute residuals on the predicted values, and a regression of the residuals on run order, each show no slope significant at α = 0.05. No run has a Cook’s distance above 4/n, where n is the number of runs in the fit.</w:t>
+        <w:t xml:space="preserve">). A regression of the absolute residuals on the predicted values, and a regression of the residuals on run order, each show no slope significant at α = 0.05. A run with a Cook’s distance above 4/n is examined by deleting it and repeating the judgement. The model fails this test only where a run’s Cook’s distance exceeds the median of the F distribution with p and n − p degrees of freedom, where p is the number of model parameters and n the number of runs.</w:t>
       </w:r>
     </w:p>
     <w:p>
@@ -8253,7 +8253,7 @@
         </w:numPr>
       </w:pPr>
       <w:r>
-        <w:t xml:space="preserve">The residuals show no pattern against predicted values or run order, and no single run dominates the fit. A regression of the absolute residuals on the predicted values, and a regression of the residuals on run order, each show no slope significant at α = 0.05. No run has a Cook’s distance above 4/n, a common screening cut-off for influential runs that scales with the number of runs n in the fit, which is 0.14 for the 28 runs of the response-surface design.</w:t>
+        <w:t xml:space="preserve">The residuals show no pattern against predicted values or run order, and no single run dominates the fit. A regression of the absolute residuals on the predicted values, and a regression of the residuals on run order, each show no slope significant at α = 0.05. A run with a Cook’s distance above 4/n is examined by deleting it and repeating the judgement. The model fails this test only where a run’s Cook’s distance exceeds the median of the F distribution with p and n − p degrees of freedom, where p is the number of model parameters and n the number of runs. The flag 4/n is a common screening cut-off for influential runs that scales with the number of runs, and it is 0.14 for the 28 runs of the response-surface design.</w:t>
       </w:r>
     </w:p>
     <w:p>

</xml_diff>

<commit_message>
PCP-003, PCP-006, PCP-007 and PCP-010 at the data state of 2026-10-11: each states the UF/DF aggregate increase PCMP-001 Version 2.0 sets and the criteria it gives (no later study named); annexes rebuilt for every re-rendered plan, all grounded
Co-Authored-By: Claude Opus 5.5 <noreply@anthropic.com>
</commit_message>
<xml_diff>
--- a/pc_package/PCP-003_bioreactor.docx
+++ b/pc_package/PCP-003_bioreactor.docx
@@ -2150,6 +2150,32 @@
               <w:jc w:val="left"/>
             </w:pPr>
             <w:r>
+              <w:t xml:space="preserve">UF/DF</w:t>
+            </w:r>
+          </w:p>
+        </w:tc>
+        <w:tc>
+          <w:tcPr/>
+          <w:p>
+            <w:pPr>
+              <w:pStyle w:val="Compact"/>
+              <w:jc w:val="left"/>
+            </w:pPr>
+            <w:r>
+              <w:t xml:space="preserve">ultrafiltration and diafiltration</w:t>
+            </w:r>
+          </w:p>
+        </w:tc>
+      </w:tr>
+      <w:tr>
+        <w:tc>
+          <w:tcPr/>
+          <w:p>
+            <w:pPr>
+              <w:pStyle w:val="Compact"/>
+              <w:jc w:val="left"/>
+            </w:pPr>
+            <w:r>
               <w:t xml:space="preserve">UPLC</w:t>
             </w:r>
           </w:p>
@@ -3074,7 +3100,7 @@
                     <w:jc w:val="center"/>
                   </w:pPr>
                   <w:r>
-                    <w:t xml:space="preserve">≤ 6.46</w:t>
+                    <w:t xml:space="preserve">≤ 6.30</w:t>
                   </w:r>
                 </w:p>
               </w:tc>
@@ -8509,7 +8535,24 @@
         <w:t xml:space="preserve"> </w:t>
       </w:r>
       <w:r>
-        <w:t xml:space="preserve">gives the intermediate acceptance criteria of the step and their derivation. Each drug substance criterion is carried back through the worst case of every downstream step, with no margin (PCMP-001 §7.3). The worst case is the platform value from X-Mab, Y-Mab and Z-Mab, unless the verification described below replaced it with an A-Mab value. The aggregate criterion is carried back through the aggregate clearance factor of cation exchange and the aggregate increase across low-pH viral inactivation. It is the drug substance limit multiplied by the clearance factor, less the increase. From the unrounded values in force this gives 5.00 × 1.4038 − 0.5586 = 6.46 % HMW, against 5.00 × 2.00 − 0.70 = 9.30 % from the platform values alone. The upper limit for acidic variants is carried back through the platform worst case of the increase across low-pH viral inactivation, 40.0 − 1.00 = 39.0 %. The lower limit is carried back unchanged at 18.0 %, which assumes that no downstream step lowers acidic variants (</w:t>
+        <w:t xml:space="preserve">gives the intermediate acceptance criteria of the step and their derivation. Each drug substance criterion is carried back through the worst case of every downstream step, with no margin (PCMP-001 §7.3). The worst case is the platform value from X-Mab, Y-Mab and Z-Mab, unless the verification described below replaced it with an A-Mab value. The aggregate criterion is carried back through the aggregate increase across UF/DF, the aggregate clearance factor of cation exchange and the aggregate increase across low-pH viral inactivation. It is the drug substance limit less the UF/DF increase, multiplied by the clearance factor, less the low-pH increase. From the unrounded values in force this gives (5.00 − 0.1039) × 1.3976 − 0.5376 = 6.30 % HMW, against 5.00 × 2.00 − 0.70 = 9.30 % from the platform values alone, which assume no change of aggregate after cation exchange. The increase in</w:t>
+      </w:r>
+      <w:r>
+        <w:t xml:space="preserve"> </w:t>
+      </w:r>
+      <w:hyperlink w:anchor="tbl-iac">
+        <w:r>
+          <w:rPr>
+            <w:rStyle w:val="Hyperlink"/>
+          </w:rPr>
+          <w:t xml:space="preserve">Table 9</w:t>
+        </w:r>
+      </w:hyperlink>
+      <w:r>
+        <w:t xml:space="preserve"> </w:t>
+      </w:r>
+      <w:r>
+        <w:t xml:space="preserve">is the sum of the two increases. The upper limit for acidic variants is carried back through the platform worst case of the increase across low-pH viral inactivation, 40.0 − 1.00 = 39.0 %. The lower limit is carried back unchanged at 18.0 %, which assumes that no downstream step lowers acidic variants (</w:t>
       </w:r>
       <w:hyperlink w:anchor="sec-risks">
         <w:r>
@@ -8756,19 +8799,19 @@
                     <w:jc w:val="center"/>
                   </w:pPr>
                   <w:r>
-                    <w:t xml:space="preserve">0.56</w:t>
-                  </w:r>
-                </w:p>
-              </w:tc>
-              <w:tc>
-                <w:tcPr/>
-                <w:p>
-                  <w:pPr>
-                    <w:pStyle w:val="Compact"/>
-                    <w:jc w:val="center"/>
-                  </w:pPr>
-                  <w:r>
-                    <w:t xml:space="preserve">≤ 6.46</w:t>
+                    <w:t xml:space="preserve">0.64</w:t>
+                  </w:r>
+                </w:p>
+              </w:tc>
+              <w:tc>
+                <w:tcPr/>
+                <w:p>
+                  <w:pPr>
+                    <w:pStyle w:val="Compact"/>
+                    <w:jc w:val="center"/>
+                  </w:pPr>
+                  <w:r>
+                    <w:t xml:space="preserve">≤ 6.30</w:t>
                   </w:r>
                 </w:p>
               </w:tc>
@@ -9243,7 +9286,7 @@
         <w:pStyle w:val="BodyText"/>
       </w:pPr>
       <w:r>
-        <w:t xml:space="preserve">The verification rule changed the criterion of this step for aggregate. The cation exchange model predicted a lower aggregate clearance within its NOR than the platform worst case of 2.00-fold. The one-sided 95 % prediction bound of a single batch for that clearance, 1.40-fold, tightened the criterion (cation exchange report PCR-007). The bound for the aggregate increase across low-pH viral inactivation, 0.56 percentage points against 0.70 on the platform, widened it (low-pH viral inactivation report PCR-006). The aggregate criterion in force, ≤ 6.46 % HMW, is stricter than the a priori criterion of ≤ 9.30 %. The bioreactor report PCR-003 argues the change by its risk, as PCMP-001 §7.5 requires.</w:t>
+        <w:t xml:space="preserve">The verification rule changed the criterion of this step for aggregate. The cation exchange model predicted a lower aggregate clearance within its NOR than the platform worst case of 2.00-fold. The one-sided 95 % prediction bound of a single batch for that clearance, 1.40-fold, tightened the criterion (cation exchange report PCR-007). The bound for the aggregate increase across low-pH viral inactivation, 0.54 percentage points against 0.70 on the platform, widened it (low-pH viral inactivation report PCR-006). PCMP-001 §7.3 also sets an increase across UF/DF, which the a priori derivation took as none. UF/DF raises aggregate within its NOR by up to 0.104 percentage points at the prediction bound of a single batch, and this tightened the criterion further. The aggregate criterion in force, ≤ 6.30 % HMW, is stricter than the a priori criterion of ≤ 9.30 %. The bioreactor report PCR-003 argues the change by its risk, as PCMP-001 §7.5 requires.</w:t>
       </w:r>
     </w:p>
     <w:bookmarkEnd w:id="51"/>

</xml_diff>